<commit_message>
:lipstick: style(modelos): Pondo a logo da Diretoria de Projetos no cabeçalho dos modelos
</commit_message>
<xml_diff>
--- a/modelos/docx/01_canvas_de_ideacao.docx
+++ b/modelos/docx/01_canvas_de_ideacao.docx
@@ -2352,7 +2352,7 @@
     <w:r>
       <w:drawing>
         <wp:inline xmlns:a="http://schemas.openxmlformats.org/drawingml/2006/main" xmlns:pic="http://schemas.openxmlformats.org/drawingml/2006/picture">
-          <wp:extent cx="1714500" cy="273050"/>
+          <wp:extent cx="2255838" cy="273050"/>
           <wp:docPr id="1" name="Picture 1"/>
           <wp:cNvGraphicFramePr>
             <a:graphicFrameLocks noChangeAspect="1"/>
@@ -2361,7 +2361,7 @@
             <a:graphicData uri="http://schemas.openxmlformats.org/drawingml/2006/picture">
               <pic:pic>
                 <pic:nvPicPr>
-                  <pic:cNvPr id="0" name="logo.png"/>
+                  <pic:cNvPr id="0" name="cabecalho.png"/>
                   <pic:cNvPicPr/>
                 </pic:nvPicPr>
                 <pic:blipFill>
@@ -2373,7 +2373,7 @@
                 <pic:spPr>
                   <a:xfrm>
                     <a:off x="0" y="0"/>
-                    <a:ext cx="1714500" cy="273050"/>
+                    <a:ext cx="2255838" cy="273050"/>
                   </a:xfrm>
                   <a:prstGeom prst="rect"/>
                 </pic:spPr>

</xml_diff>